<commit_message>
Update concurso schedule dates
</commit_message>
<xml_diff>
--- a/public/regulamento-concurso-curtas-2026.docx
+++ b/public/regulamento-concurso-curtas-2026.docx
@@ -414,7 +414,7 @@
           <w:rFonts w:ascii="Arial" w:cs="Arial" w:eastAsia="Arial" w:hAnsi="Arial"/>
           <w:rtl w:val="0"/>
         </w:rPr>
-        <w:t xml:space="preserve"> 15 de maio a 15 de julho de 2026</w:t>
+        <w:t xml:space="preserve"> 15 de maio a 30 de junho de 2026</w:t>
       </w:r>
     </w:p>
     <w:p>
@@ -553,7 +553,7 @@
           <w:rFonts w:ascii="Arial" w:cs="Arial" w:eastAsia="Arial" w:hAnsi="Arial"/>
           <w:rtl w:val="0"/>
         </w:rPr>
-        <w:t xml:space="preserve"> 1 a 15 de agosto de 2026</w:t>
+        <w:t xml:space="preserve"> 16 a 31 de julho de 2026</w:t>
       </w:r>
     </w:p>
     <w:p>
@@ -581,7 +581,7 @@
           <w:rFonts w:ascii="Arial" w:cs="Arial" w:eastAsia="Arial" w:hAnsi="Arial"/>
           <w:rtl w:val="0"/>
         </w:rPr>
-        <w:t xml:space="preserve">16 a 31 de agosto de 2026</w:t>
+        <w:t xml:space="preserve">1 a 15 de agosto de 2026</w:t>
       </w:r>
     </w:p>
     <w:p>
@@ -609,7 +609,7 @@
           <w:rFonts w:ascii="Arial" w:cs="Arial" w:eastAsia="Arial" w:hAnsi="Arial"/>
           <w:rtl w:val="0"/>
         </w:rPr>
-        <w:t xml:space="preserve"> 1 a 15 de setembro de 2026</w:t>
+        <w:t xml:space="preserve"> 16 a 31 de agosto de 2026</w:t>
       </w:r>
     </w:p>
     <w:p>
@@ -637,7 +637,7 @@
           <w:rFonts w:ascii="Arial" w:cs="Arial" w:eastAsia="Arial" w:hAnsi="Arial"/>
           <w:rtl w:val="0"/>
         </w:rPr>
-        <w:t xml:space="preserve"> 16 de setembro a 31 de dezembro de 2026</w:t>
+        <w:t xml:space="preserve"> 1 de setembro a 15 de dezembro de 2026</w:t>
       </w:r>
     </w:p>
     <w:p>
@@ -2133,7 +2133,7 @@
                 <w:rFonts w:ascii="Arial" w:cs="Arial" w:eastAsia="Arial" w:hAnsi="Arial"/>
                 <w:rtl w:val="0"/>
               </w:rPr>
-              <w:t xml:space="preserve">15 maio – 15 julho 2026</w:t>
+              <w:t xml:space="preserve">15 maio – 30 junho 2026</w:t>
             </w:r>
           </w:p>
         </w:tc>
@@ -2179,7 +2179,7 @@
                 <w:rFonts w:ascii="Arial" w:cs="Arial" w:eastAsia="Arial" w:hAnsi="Arial"/>
                 <w:rtl w:val="0"/>
               </w:rPr>
-              <w:t xml:space="preserve">16 – 31 julho 2026</w:t>
+              <w:t xml:space="preserve">1 – 15 julho 2026</w:t>
             </w:r>
           </w:p>
         </w:tc>
@@ -2225,7 +2225,7 @@
                 <w:rFonts w:ascii="Arial" w:cs="Arial" w:eastAsia="Arial" w:hAnsi="Arial"/>
                 <w:rtl w:val="0"/>
               </w:rPr>
-              <w:t xml:space="preserve">1 – 15 agosto 2026</w:t>
+              <w:t xml:space="preserve">16 – 31 julho 2026</w:t>
             </w:r>
           </w:p>
         </w:tc>
@@ -2272,7 +2272,7 @@
                 <w:rFonts w:ascii="Arial" w:cs="Arial" w:eastAsia="Arial" w:hAnsi="Arial"/>
                 <w:rtl w:val="0"/>
               </w:rPr>
-              <w:t xml:space="preserve">16 – 31 agosto 2026</w:t>
+              <w:t xml:space="preserve">1 – 15 agosto 2026</w:t>
             </w:r>
           </w:p>
         </w:tc>
@@ -2318,7 +2318,7 @@
                 <w:rFonts w:ascii="Arial" w:cs="Arial" w:eastAsia="Arial" w:hAnsi="Arial"/>
                 <w:rtl w:val="0"/>
               </w:rPr>
-              <w:t xml:space="preserve">1 – 15 setembro 2026</w:t>
+              <w:t xml:space="preserve">16 – 31 agosto 2026</w:t>
             </w:r>
           </w:p>
         </w:tc>
@@ -2364,7 +2364,7 @@
                 <w:rFonts w:ascii="Arial" w:cs="Arial" w:eastAsia="Arial" w:hAnsi="Arial"/>
                 <w:rtl w:val="0"/>
               </w:rPr>
-              <w:t xml:space="preserve">16 setembro – 31 dezembro 2026</w:t>
+              <w:t xml:space="preserve">1 setembro – 15 dezembro 2026</w:t>
             </w:r>
           </w:p>
         </w:tc>

</xml_diff>